<commit_message>
Add correct user story document
</commit_message>
<xml_diff>
--- a/user story.docx
+++ b/user story.docx
@@ -4,11 +4,6 @@
   <w:body>
     <w:p>
       <w:pPr>
-        <w:pStyle w:val="a9"/>
-        <w:numPr>
-          <w:ilvl w:val="0"/>
-          <w:numId w:val="1"/>
-        </w:numPr>
         <w:rPr>
           <w:sz w:val="24"/>
         </w:rPr>
@@ -17,645 +12,167 @@
         <w:rPr>
           <w:sz w:val="24"/>
         </w:rPr>
-        <w:t>As a user</w:t>
-      </w:r>
-      <w:r>
-        <w:rPr>
-          <w:rFonts w:hint="eastAsia"/>
-          <w:sz w:val="24"/>
-        </w:rPr>
-        <w:t>,</w:t>
-      </w:r>
-      <w:r>
-        <w:rPr>
-          <w:sz w:val="24"/>
-        </w:rPr>
-        <w:t xml:space="preserve"> I want a vote time place so that I can choose my </w:t>
-      </w:r>
-      <w:r>
-        <w:rPr>
-          <w:sz w:val="24"/>
-        </w:rPr>
-        <w:t>favorite</w:t>
-      </w:r>
-      <w:r>
-        <w:rPr>
-          <w:sz w:val="24"/>
-        </w:rPr>
-        <w:t xml:space="preserve"> time to join activity.</w:t>
+        <w:t>1. As a user, I want to vote on event time and location, so that I can choose the most convenient option.</w:t>
       </w:r>
     </w:p>
     <w:p>
       <w:pPr>
-        <w:pStyle w:val="a9"/>
-        <w:numPr>
-          <w:ilvl w:val="0"/>
-          <w:numId w:val="1"/>
-        </w:numPr>
         <w:rPr>
           <w:sz w:val="24"/>
         </w:rPr>
       </w:pPr>
       <w:r>
         <w:rPr>
-          <w:rFonts w:hint="eastAsia"/>
-          <w:sz w:val="24"/>
-        </w:rPr>
-        <w:t>As a</w:t>
-      </w:r>
-      <w:r>
-        <w:rPr>
-          <w:rFonts w:hint="eastAsia"/>
-          <w:sz w:val="24"/>
-        </w:rPr>
-        <w:t xml:space="preserve"> user,</w:t>
-      </w:r>
-      <w:r>
-        <w:rPr>
-          <w:rFonts w:hint="eastAsia"/>
-          <w:sz w:val="24"/>
-        </w:rPr>
-        <w:t xml:space="preserve"> I want to choose whether my event is public or private, so that I can control who can discover and join it.</w:t>
+          <w:sz w:val="24"/>
+        </w:rPr>
+        <w:t>2. As a user, I want to set my event as public or private, so that I can control who can discover and join it.</w:t>
       </w:r>
     </w:p>
     <w:p>
       <w:pPr>
-        <w:pStyle w:val="a9"/>
-        <w:numPr>
-          <w:ilvl w:val="0"/>
-          <w:numId w:val="1"/>
-        </w:numPr>
         <w:rPr>
           <w:sz w:val="24"/>
         </w:rPr>
       </w:pPr>
       <w:r>
         <w:rPr>
-          <w:rFonts w:hint="eastAsia"/>
-          <w:sz w:val="24"/>
-        </w:rPr>
-        <w:t>As a user</w:t>
-      </w:r>
-      <w:r>
-        <w:rPr>
-          <w:rFonts w:hint="eastAsia"/>
-          <w:sz w:val="24"/>
-        </w:rPr>
-        <w:t xml:space="preserve">, </w:t>
-      </w:r>
-      <w:r>
-        <w:rPr>
-          <w:rFonts w:hint="eastAsia"/>
-          <w:sz w:val="24"/>
-        </w:rPr>
-        <w:t>I want to update the event's title, date, location, or description at any time, so that attendees always see the latest, accurate information.</w:t>
+          <w:sz w:val="24"/>
+        </w:rPr>
+        <w:t>3. As a user, I want to update event details (title, date, location, description), so that attendees always see accurate information</w:t>
       </w:r>
     </w:p>
     <w:p>
       <w:pPr>
-        <w:pStyle w:val="a9"/>
-        <w:numPr>
-          <w:ilvl w:val="0"/>
-          <w:numId w:val="1"/>
-        </w:numPr>
         <w:rPr>
           <w:sz w:val="24"/>
         </w:rPr>
       </w:pPr>
       <w:r>
         <w:rPr>
-          <w:rFonts w:hint="eastAsia"/>
-          <w:sz w:val="24"/>
-        </w:rPr>
-        <w:t>As a user, I want to send invitations to specific people by email or username, so that the right attendees are notified and can confirm their attendance.</w:t>
+          <w:sz w:val="24"/>
+        </w:rPr>
+        <w:t>4. As a user, I want to send invitations via email or username, so that specific people can join my event.</w:t>
       </w:r>
     </w:p>
     <w:p>
       <w:pPr>
-        <w:pStyle w:val="a9"/>
-        <w:numPr>
-          <w:ilvl w:val="0"/>
-          <w:numId w:val="1"/>
-        </w:numPr>
         <w:rPr>
           <w:sz w:val="24"/>
         </w:rPr>
       </w:pPr>
       <w:r>
         <w:rPr>
-          <w:rFonts w:hint="eastAsia"/>
-          <w:sz w:val="24"/>
-        </w:rPr>
-        <w:t>As a</w:t>
+          <w:sz w:val="24"/>
+        </w:rPr>
+        <w:t xml:space="preserve">5. As a user, I want to add tasks and timeline steps to the event workspace, so that I can </w:t>
       </w:r>
+      <w:proofErr w:type="spellStart"/>
       <w:r>
         <w:rPr>
-          <w:rFonts w:hint="eastAsia"/>
-          <w:sz w:val="24"/>
-        </w:rPr>
-        <w:t xml:space="preserve"> user</w:t>
+          <w:sz w:val="24"/>
+        </w:rPr>
+        <w:t>organise</w:t>
       </w:r>
+      <w:proofErr w:type="spellEnd"/>
       <w:r>
         <w:rPr>
-          <w:rFonts w:hint="eastAsia"/>
-          <w:sz w:val="24"/>
-        </w:rPr>
-        <w:t>, I want to add tasks and timeline steps to the event workspace, so that I can break planning into clear actions and track progress without using a separate tool.</w:t>
+          <w:sz w:val="24"/>
+        </w:rPr>
+        <w:t xml:space="preserve"> planning and track progress.</w:t>
       </w:r>
     </w:p>
     <w:p>
       <w:pPr>
-        <w:pStyle w:val="a9"/>
-        <w:numPr>
-          <w:ilvl w:val="0"/>
-          <w:numId w:val="1"/>
-        </w:numPr>
         <w:rPr>
           <w:sz w:val="24"/>
         </w:rPr>
       </w:pPr>
       <w:r>
         <w:rPr>
-          <w:rFonts w:hint="eastAsia"/>
-          <w:sz w:val="24"/>
-        </w:rPr>
-        <w:t>As a </w:t>
-      </w:r>
-      <w:r>
-        <w:rPr>
-          <w:rFonts w:hint="eastAsia"/>
-          <w:sz w:val="24"/>
-        </w:rPr>
-        <w:t>visitor</w:t>
-      </w:r>
-      <w:r>
-        <w:rPr>
-          <w:rFonts w:hint="eastAsia"/>
-          <w:sz w:val="24"/>
-        </w:rPr>
-        <w:t>, I want to browse a list of public events in my area, so that I can decide whether Eventure is useful to me before creating an account.</w:t>
+          <w:sz w:val="24"/>
+        </w:rPr>
+        <w:t>6. As a visitor, I want to browse public events, so that I can explore events before creating an account.</w:t>
       </w:r>
     </w:p>
     <w:p>
       <w:pPr>
-        <w:pStyle w:val="a9"/>
-        <w:numPr>
-          <w:ilvl w:val="0"/>
-          <w:numId w:val="1"/>
-        </w:numPr>
         <w:rPr>
           <w:sz w:val="24"/>
         </w:rPr>
       </w:pPr>
       <w:r>
         <w:rPr>
-          <w:rFonts w:hint="eastAsia"/>
-          <w:sz w:val="24"/>
-        </w:rPr>
-        <w:t xml:space="preserve">As a visitor, I want to create an account in a few steps, so that I can start </w:t>
-      </w:r>
-      <w:r>
-        <w:rPr>
-          <w:sz w:val="24"/>
-        </w:rPr>
-        <w:t>organizing</w:t>
-      </w:r>
-      <w:r>
-        <w:rPr>
-          <w:rFonts w:hint="eastAsia"/>
-          <w:sz w:val="24"/>
-        </w:rPr>
-        <w:t xml:space="preserve"> or joining events without confusion.</w:t>
+          <w:sz w:val="24"/>
+        </w:rPr>
+        <w:t>7. As a visitor, I want to create an account easily, so that I can start using the platform quickly.</w:t>
       </w:r>
     </w:p>
     <w:p>
       <w:pPr>
-        <w:pStyle w:val="a9"/>
-        <w:numPr>
-          <w:ilvl w:val="0"/>
-          <w:numId w:val="1"/>
-        </w:numPr>
         <w:rPr>
           <w:sz w:val="24"/>
         </w:rPr>
       </w:pPr>
       <w:r>
         <w:rPr>
-          <w:rFonts w:hint="eastAsia"/>
-          <w:sz w:val="24"/>
-        </w:rPr>
-        <w:t xml:space="preserve">As </w:t>
-      </w:r>
-      <w:r>
-        <w:rPr>
-          <w:rFonts w:hint="eastAsia"/>
-          <w:sz w:val="24"/>
-        </w:rPr>
-        <w:t xml:space="preserve">a </w:t>
-      </w:r>
-      <w:r>
-        <w:rPr>
-          <w:rFonts w:hint="eastAsia"/>
-          <w:sz w:val="24"/>
-        </w:rPr>
-        <w:t xml:space="preserve">registered </w:t>
-      </w:r>
-      <w:r>
-        <w:rPr>
-          <w:rFonts w:hint="eastAsia"/>
-          <w:sz w:val="24"/>
-        </w:rPr>
-        <w:t xml:space="preserve">user, </w:t>
-      </w:r>
-      <w:r>
-        <w:rPr>
-          <w:rFonts w:hint="eastAsia"/>
-          <w:sz w:val="24"/>
-        </w:rPr>
-        <w:t xml:space="preserve">I </w:t>
-      </w:r>
-      <w:r>
-        <w:rPr>
-          <w:rFonts w:hint="eastAsia"/>
-          <w:sz w:val="24"/>
-        </w:rPr>
-        <w:t>want</w:t>
-      </w:r>
-      <w:r>
-        <w:rPr>
-          <w:rFonts w:hint="eastAsia"/>
-          <w:sz w:val="24"/>
-        </w:rPr>
-        <w:t xml:space="preserve"> to be able to log in quickly with my email and password so that I can immediately </w:t>
-      </w:r>
-      <w:r>
-        <w:rPr>
-          <w:rFonts w:hint="eastAsia"/>
-          <w:sz w:val="24"/>
-        </w:rPr>
-        <w:t>see my activity</w:t>
-      </w:r>
-      <w:r>
-        <w:rPr>
-          <w:rFonts w:hint="eastAsia"/>
-          <w:sz w:val="24"/>
-        </w:rPr>
-        <w:t>.</w:t>
+          <w:sz w:val="24"/>
+        </w:rPr>
+        <w:t>8. As a registered user, I want to log in using my email and password, so that I can access my account.</w:t>
       </w:r>
     </w:p>
     <w:p>
       <w:pPr>
-        <w:pStyle w:val="a9"/>
-        <w:numPr>
-          <w:ilvl w:val="0"/>
-          <w:numId w:val="1"/>
-        </w:numPr>
         <w:rPr>
           <w:sz w:val="24"/>
         </w:rPr>
       </w:pPr>
       <w:r>
         <w:rPr>
-          <w:rFonts w:hint="eastAsia"/>
-          <w:sz w:val="24"/>
-        </w:rPr>
-        <w:t xml:space="preserve">As a user, I want </w:t>
-      </w:r>
-      <w:r>
-        <w:rPr>
-          <w:rFonts w:hint="eastAsia"/>
-          <w:sz w:val="24"/>
-        </w:rPr>
-        <w:t xml:space="preserve">a filter type </w:t>
-      </w:r>
-      <w:r>
-        <w:rPr>
-          <w:rFonts w:hint="eastAsia"/>
-          <w:sz w:val="24"/>
-        </w:rPr>
-        <w:t>function</w:t>
-      </w:r>
-      <w:r>
-        <w:rPr>
-          <w:rFonts w:hint="eastAsia"/>
-          <w:sz w:val="24"/>
-        </w:rPr>
-        <w:t xml:space="preserve">, so that I can </w:t>
-      </w:r>
-      <w:r>
-        <w:rPr>
-          <w:rFonts w:hint="eastAsia"/>
-          <w:sz w:val="24"/>
-        </w:rPr>
-        <w:t>find my interested type of activity</w:t>
-      </w:r>
-      <w:r>
-        <w:rPr>
-          <w:rFonts w:hint="eastAsia"/>
-          <w:sz w:val="24"/>
-        </w:rPr>
-        <w:t>.</w:t>
+          <w:sz w:val="24"/>
+        </w:rPr>
+        <w:t>9. As a user, I want to filter events by category or type, so that I can find events that match my interests.</w:t>
       </w:r>
     </w:p>
     <w:p>
       <w:pPr>
-        <w:pStyle w:val="a9"/>
-        <w:numPr>
-          <w:ilvl w:val="0"/>
-          <w:numId w:val="1"/>
-        </w:numPr>
         <w:rPr>
           <w:sz w:val="24"/>
         </w:rPr>
       </w:pPr>
       <w:r>
         <w:rPr>
-          <w:rFonts w:hint="eastAsia"/>
-          <w:sz w:val="24"/>
-        </w:rPr>
-        <w:t xml:space="preserve">As a user, I want </w:t>
-      </w:r>
-      <w:r>
-        <w:rPr>
-          <w:sz w:val="24"/>
-        </w:rPr>
-        <w:t>a</w:t>
-      </w:r>
-      <w:r>
-        <w:rPr>
-          <w:rFonts w:hint="eastAsia"/>
-          <w:sz w:val="24"/>
-        </w:rPr>
-        <w:t>n</w:t>
-      </w:r>
-      <w:r>
-        <w:rPr>
-          <w:rFonts w:hint="eastAsia"/>
-          <w:sz w:val="24"/>
-        </w:rPr>
-        <w:t xml:space="preserve"> </w:t>
-      </w:r>
-      <w:r>
-        <w:rPr>
-          <w:rFonts w:hint="eastAsia"/>
-          <w:sz w:val="24"/>
-        </w:rPr>
-        <w:t>edit</w:t>
-      </w:r>
-      <w:r>
-        <w:rPr>
-          <w:rFonts w:hint="eastAsia"/>
-          <w:sz w:val="24"/>
-        </w:rPr>
-        <w:t xml:space="preserve"> </w:t>
-      </w:r>
-      <w:r>
-        <w:rPr>
-          <w:rFonts w:hint="eastAsia"/>
-          <w:sz w:val="24"/>
-        </w:rPr>
-        <w:t>event</w:t>
-      </w:r>
-      <w:r>
-        <w:rPr>
-          <w:rFonts w:hint="eastAsia"/>
-          <w:sz w:val="24"/>
-        </w:rPr>
-        <w:t xml:space="preserve"> </w:t>
-      </w:r>
-      <w:r>
-        <w:rPr>
-          <w:rFonts w:hint="eastAsia"/>
-          <w:sz w:val="24"/>
-        </w:rPr>
-        <w:t>function</w:t>
-      </w:r>
-      <w:r>
-        <w:rPr>
-          <w:rFonts w:hint="eastAsia"/>
-          <w:sz w:val="24"/>
-        </w:rPr>
-        <w:t xml:space="preserve">, so that I can </w:t>
-      </w:r>
-      <w:r>
-        <w:rPr>
-          <w:rFonts w:hint="eastAsia"/>
-          <w:sz w:val="24"/>
-        </w:rPr>
-        <w:t>change</w:t>
-      </w:r>
-      <w:r>
-        <w:rPr>
-          <w:rFonts w:hint="eastAsia"/>
-          <w:sz w:val="24"/>
-        </w:rPr>
-        <w:t xml:space="preserve"> my activity</w:t>
-      </w:r>
-      <w:r>
-        <w:rPr>
-          <w:rFonts w:hint="eastAsia"/>
-          <w:sz w:val="24"/>
-        </w:rPr>
-        <w:t xml:space="preserve"> </w:t>
-      </w:r>
-      <w:r>
-        <w:rPr>
-          <w:sz w:val="24"/>
-        </w:rPr>
-        <w:t>detail</w:t>
-      </w:r>
-      <w:r>
-        <w:rPr>
-          <w:rFonts w:hint="eastAsia"/>
-          <w:sz w:val="24"/>
-        </w:rPr>
-        <w:t>s</w:t>
-      </w:r>
-      <w:r>
-        <w:rPr>
-          <w:rFonts w:hint="eastAsia"/>
-          <w:sz w:val="24"/>
-        </w:rPr>
-        <w:t xml:space="preserve"> easily</w:t>
-      </w:r>
-      <w:r>
-        <w:rPr>
-          <w:rFonts w:hint="eastAsia"/>
-          <w:sz w:val="24"/>
-        </w:rPr>
-        <w:t>.</w:t>
+          <w:sz w:val="24"/>
+        </w:rPr>
+        <w:t>10. (Remove – duplicate of updating event)</w:t>
       </w:r>
     </w:p>
     <w:p>
       <w:pPr>
-        <w:pStyle w:val="a9"/>
-        <w:numPr>
-          <w:ilvl w:val="0"/>
-          <w:numId w:val="1"/>
-        </w:numPr>
         <w:rPr>
           <w:sz w:val="24"/>
         </w:rPr>
       </w:pPr>
       <w:r>
         <w:rPr>
-          <w:rFonts w:hint="eastAsia"/>
-          <w:sz w:val="24"/>
-        </w:rPr>
-        <w:t xml:space="preserve">As a user, I want </w:t>
+          <w:sz w:val="24"/>
+        </w:rPr>
+        <w:t xml:space="preserve">11. As a user, I want a quick join option, so that I can join events with fewer </w:t>
       </w:r>
       <w:r>
         <w:rPr>
           <w:sz w:val="24"/>
         </w:rPr>
-        <w:t>a</w:t>
-      </w:r>
-      <w:r>
-        <w:rPr>
-          <w:rFonts w:hint="eastAsia"/>
-          <w:sz w:val="24"/>
-        </w:rPr>
-        <w:t xml:space="preserve"> </w:t>
-      </w:r>
-      <w:r>
-        <w:rPr>
-          <w:rFonts w:hint="eastAsia"/>
-          <w:sz w:val="24"/>
-        </w:rPr>
-        <w:t>quick join</w:t>
-      </w:r>
-      <w:r>
-        <w:rPr>
-          <w:rFonts w:hint="eastAsia"/>
-          <w:sz w:val="24"/>
-        </w:rPr>
-        <w:t xml:space="preserve"> </w:t>
-      </w:r>
-      <w:r>
-        <w:rPr>
-          <w:rFonts w:hint="eastAsia"/>
-          <w:sz w:val="24"/>
-        </w:rPr>
-        <w:t>function</w:t>
-      </w:r>
-      <w:r>
-        <w:rPr>
-          <w:rFonts w:hint="eastAsia"/>
-          <w:sz w:val="24"/>
-        </w:rPr>
-        <w:t xml:space="preserve">, so that I </w:t>
-      </w:r>
-      <w:r>
-        <w:rPr>
-          <w:rFonts w:hint="eastAsia"/>
-          <w:sz w:val="24"/>
-        </w:rPr>
-        <w:t>join</w:t>
-      </w:r>
-      <w:r>
-        <w:rPr>
-          <w:rFonts w:hint="eastAsia"/>
-          <w:sz w:val="24"/>
-        </w:rPr>
-        <w:t xml:space="preserve"> my </w:t>
-      </w:r>
-      <w:r>
-        <w:rPr>
-          <w:rFonts w:hint="eastAsia"/>
-          <w:sz w:val="24"/>
-        </w:rPr>
-        <w:t xml:space="preserve">interested </w:t>
-      </w:r>
-      <w:r>
-        <w:rPr>
-          <w:rFonts w:hint="eastAsia"/>
-          <w:sz w:val="24"/>
-        </w:rPr>
-        <w:t xml:space="preserve">activity </w:t>
-      </w:r>
-      <w:r>
-        <w:rPr>
-          <w:rFonts w:hint="eastAsia"/>
-          <w:sz w:val="24"/>
-        </w:rPr>
         <w:lastRenderedPageBreak/>
-        <w:t>with fewer steps</w:t>
-      </w:r>
-      <w:r>
-        <w:rPr>
-          <w:rFonts w:hint="eastAsia"/>
-          <w:sz w:val="24"/>
-        </w:rPr>
-        <w:t>.</w:t>
+        <w:t>steps.</w:t>
       </w:r>
     </w:p>
     <w:p>
-      <w:pPr>
-        <w:pStyle w:val="a9"/>
-        <w:numPr>
-          <w:ilvl w:val="0"/>
-          <w:numId w:val="1"/>
-        </w:numPr>
-        <w:rPr>
-          <w:sz w:val="24"/>
-        </w:rPr>
-      </w:pPr>
       <w:r>
         <w:rPr>
-          <w:rFonts w:hint="eastAsia"/>
-          <w:sz w:val="24"/>
-        </w:rPr>
-        <w:t xml:space="preserve">As a user, I want </w:t>
+          <w:sz w:val="24"/>
+        </w:rPr>
+        <w:t>12. As a user, I want to track invitation status, so that I can see who has accepted or declined.</w:t>
       </w:r>
-      <w:r>
-        <w:rPr>
-          <w:rFonts w:hint="eastAsia"/>
-          <w:sz w:val="24"/>
-        </w:rPr>
-        <w:t>to see the progress of invitation</w:t>
-      </w:r>
-      <w:r>
-        <w:rPr>
-          <w:rFonts w:hint="eastAsia"/>
-          <w:sz w:val="24"/>
-        </w:rPr>
-        <w:t xml:space="preserve">, so that I </w:t>
-      </w:r>
-      <w:r>
-        <w:rPr>
-          <w:rFonts w:hint="eastAsia"/>
-          <w:sz w:val="24"/>
-        </w:rPr>
-        <w:t xml:space="preserve">can know </w:t>
-      </w:r>
-      <w:r>
-        <w:rPr>
-          <w:rFonts w:hint="eastAsia"/>
-          <w:sz w:val="24"/>
-        </w:rPr>
-        <w:t>how long</w:t>
-      </w:r>
-      <w:r>
-        <w:rPr>
-          <w:rFonts w:hint="eastAsia"/>
-          <w:sz w:val="24"/>
-        </w:rPr>
-        <w:t xml:space="preserve"> I wait for invitation success</w:t>
-      </w:r>
-      <w:r>
-        <w:rPr>
-          <w:rFonts w:hint="eastAsia"/>
-          <w:sz w:val="24"/>
-        </w:rPr>
-        <w:t>.</w:t>
-      </w:r>
-    </w:p>
-    <w:p>
-      <w:pPr>
-        <w:rPr>
-          <w:rFonts w:hint="eastAsia"/>
-        </w:rPr>
-      </w:pPr>
     </w:p>
     <w:sectPr>
       <w:pgSz w:w="11906" w:h="16838"/>
@@ -1161,18 +678,18 @@
     <w:lsdException w:name="Unresolved Mention" w:semiHidden="1" w:unhideWhenUsed="1"/>
     <w:lsdException w:name="Smart Link" w:semiHidden="1" w:unhideWhenUsed="1"/>
   </w:latentStyles>
-  <w:style w:type="paragraph" w:default="1" w:styleId="a">
+  <w:style w:type="paragraph" w:default="1" w:styleId="Normal">
     <w:name w:val="Normal"/>
     <w:qFormat/>
     <w:pPr>
       <w:widowControl w:val="0"/>
     </w:pPr>
   </w:style>
-  <w:style w:type="paragraph" w:styleId="1">
+  <w:style w:type="paragraph" w:styleId="Heading1">
     <w:name w:val="heading 1"/>
-    <w:basedOn w:val="a"/>
-    <w:next w:val="a"/>
-    <w:link w:val="10"/>
+    <w:basedOn w:val="Normal"/>
+    <w:next w:val="Normal"/>
+    <w:link w:val="Heading1Char"/>
     <w:uiPriority w:val="9"/>
     <w:qFormat/>
     <w:rsid w:val="00842B12"/>
@@ -1189,11 +706,11 @@
       <w:szCs w:val="48"/>
     </w:rPr>
   </w:style>
-  <w:style w:type="paragraph" w:styleId="2">
+  <w:style w:type="paragraph" w:styleId="Heading2">
     <w:name w:val="heading 2"/>
-    <w:basedOn w:val="a"/>
-    <w:next w:val="a"/>
-    <w:link w:val="20"/>
+    <w:basedOn w:val="Normal"/>
+    <w:next w:val="Normal"/>
+    <w:link w:val="Heading2Char"/>
     <w:uiPriority w:val="9"/>
     <w:semiHidden/>
     <w:unhideWhenUsed/>
@@ -1212,11 +729,11 @@
       <w:szCs w:val="40"/>
     </w:rPr>
   </w:style>
-  <w:style w:type="paragraph" w:styleId="3">
+  <w:style w:type="paragraph" w:styleId="Heading3">
     <w:name w:val="heading 3"/>
-    <w:basedOn w:val="a"/>
-    <w:next w:val="a"/>
-    <w:link w:val="30"/>
+    <w:basedOn w:val="Normal"/>
+    <w:next w:val="Normal"/>
+    <w:link w:val="Heading3Char"/>
     <w:uiPriority w:val="9"/>
     <w:semiHidden/>
     <w:unhideWhenUsed/>
@@ -1235,11 +752,11 @@
       <w:szCs w:val="32"/>
     </w:rPr>
   </w:style>
-  <w:style w:type="paragraph" w:styleId="4">
+  <w:style w:type="paragraph" w:styleId="Heading4">
     <w:name w:val="heading 4"/>
-    <w:basedOn w:val="a"/>
-    <w:next w:val="a"/>
-    <w:link w:val="40"/>
+    <w:basedOn w:val="Normal"/>
+    <w:next w:val="Normal"/>
+    <w:link w:val="Heading4Char"/>
     <w:uiPriority w:val="9"/>
     <w:semiHidden/>
     <w:unhideWhenUsed/>
@@ -1258,11 +775,11 @@
       <w:szCs w:val="28"/>
     </w:rPr>
   </w:style>
-  <w:style w:type="paragraph" w:styleId="5">
+  <w:style w:type="paragraph" w:styleId="Heading5">
     <w:name w:val="heading 5"/>
-    <w:basedOn w:val="a"/>
-    <w:next w:val="a"/>
-    <w:link w:val="50"/>
+    <w:basedOn w:val="Normal"/>
+    <w:next w:val="Normal"/>
+    <w:link w:val="Heading5Char"/>
     <w:uiPriority w:val="9"/>
     <w:semiHidden/>
     <w:unhideWhenUsed/>
@@ -1280,11 +797,11 @@
       <w:sz w:val="24"/>
     </w:rPr>
   </w:style>
-  <w:style w:type="paragraph" w:styleId="6">
+  <w:style w:type="paragraph" w:styleId="Heading6">
     <w:name w:val="heading 6"/>
-    <w:basedOn w:val="a"/>
-    <w:next w:val="a"/>
-    <w:link w:val="60"/>
+    <w:basedOn w:val="Normal"/>
+    <w:next w:val="Normal"/>
+    <w:link w:val="Heading6Char"/>
     <w:uiPriority w:val="9"/>
     <w:semiHidden/>
     <w:unhideWhenUsed/>
@@ -1303,11 +820,11 @@
       <w:color w:val="0F4761" w:themeColor="accent1" w:themeShade="BF"/>
     </w:rPr>
   </w:style>
-  <w:style w:type="paragraph" w:styleId="7">
+  <w:style w:type="paragraph" w:styleId="Heading7">
     <w:name w:val="heading 7"/>
-    <w:basedOn w:val="a"/>
-    <w:next w:val="a"/>
-    <w:link w:val="70"/>
+    <w:basedOn w:val="Normal"/>
+    <w:next w:val="Normal"/>
+    <w:link w:val="Heading7Char"/>
     <w:uiPriority w:val="9"/>
     <w:semiHidden/>
     <w:unhideWhenUsed/>
@@ -1326,11 +843,11 @@
       <w:color w:val="595959" w:themeColor="text1" w:themeTint="A6"/>
     </w:rPr>
   </w:style>
-  <w:style w:type="paragraph" w:styleId="8">
+  <w:style w:type="paragraph" w:styleId="Heading8">
     <w:name w:val="heading 8"/>
-    <w:basedOn w:val="a"/>
-    <w:next w:val="a"/>
-    <w:link w:val="80"/>
+    <w:basedOn w:val="Normal"/>
+    <w:next w:val="Normal"/>
+    <w:link w:val="Heading8Char"/>
     <w:uiPriority w:val="9"/>
     <w:semiHidden/>
     <w:unhideWhenUsed/>
@@ -1347,11 +864,11 @@
       <w:color w:val="595959" w:themeColor="text1" w:themeTint="A6"/>
     </w:rPr>
   </w:style>
-  <w:style w:type="paragraph" w:styleId="9">
+  <w:style w:type="paragraph" w:styleId="Heading9">
     <w:name w:val="heading 9"/>
-    <w:basedOn w:val="a"/>
-    <w:next w:val="a"/>
-    <w:link w:val="90"/>
+    <w:basedOn w:val="Normal"/>
+    <w:next w:val="Normal"/>
+    <w:link w:val="Heading9Char"/>
     <w:uiPriority w:val="9"/>
     <w:semiHidden/>
     <w:unhideWhenUsed/>
@@ -1368,12 +885,13 @@
       <w:color w:val="595959" w:themeColor="text1" w:themeTint="A6"/>
     </w:rPr>
   </w:style>
-  <w:style w:type="character" w:default="1" w:styleId="a0">
+  <w:style w:type="character" w:default="1" w:styleId="DefaultParagraphFont">
     <w:name w:val="Default Paragraph Font"/>
     <w:uiPriority w:val="1"/>
+    <w:semiHidden/>
     <w:unhideWhenUsed/>
   </w:style>
-  <w:style w:type="table" w:default="1" w:styleId="a1">
+  <w:style w:type="table" w:default="1" w:styleId="TableNormal">
     <w:name w:val="Normal Table"/>
     <w:uiPriority w:val="99"/>
     <w:semiHidden/>
@@ -1388,16 +906,16 @@
       </w:tblCellMar>
     </w:tblPr>
   </w:style>
-  <w:style w:type="numbering" w:default="1" w:styleId="a2">
+  <w:style w:type="numbering" w:default="1" w:styleId="NoList">
     <w:name w:val="No List"/>
     <w:uiPriority w:val="99"/>
     <w:semiHidden/>
     <w:unhideWhenUsed/>
   </w:style>
-  <w:style w:type="character" w:customStyle="1" w:styleId="10">
-    <w:name w:val="标题 1 字符"/>
-    <w:basedOn w:val="a0"/>
-    <w:link w:val="1"/>
+  <w:style w:type="character" w:customStyle="1" w:styleId="Heading1Char">
+    <w:name w:val="Heading 1 Char"/>
+    <w:basedOn w:val="DefaultParagraphFont"/>
+    <w:link w:val="Heading1"/>
     <w:uiPriority w:val="9"/>
     <w:rsid w:val="00842B12"/>
     <w:rPr>
@@ -1407,10 +925,10 @@
       <w:szCs w:val="48"/>
     </w:rPr>
   </w:style>
-  <w:style w:type="character" w:customStyle="1" w:styleId="20">
-    <w:name w:val="标题 2 字符"/>
-    <w:basedOn w:val="a0"/>
-    <w:link w:val="2"/>
+  <w:style w:type="character" w:customStyle="1" w:styleId="Heading2Char">
+    <w:name w:val="Heading 2 Char"/>
+    <w:basedOn w:val="DefaultParagraphFont"/>
+    <w:link w:val="Heading2"/>
     <w:uiPriority w:val="9"/>
     <w:semiHidden/>
     <w:rsid w:val="00842B12"/>
@@ -1421,10 +939,10 @@
       <w:szCs w:val="40"/>
     </w:rPr>
   </w:style>
-  <w:style w:type="character" w:customStyle="1" w:styleId="30">
-    <w:name w:val="标题 3 字符"/>
-    <w:basedOn w:val="a0"/>
-    <w:link w:val="3"/>
+  <w:style w:type="character" w:customStyle="1" w:styleId="Heading3Char">
+    <w:name w:val="Heading 3 Char"/>
+    <w:basedOn w:val="DefaultParagraphFont"/>
+    <w:link w:val="Heading3"/>
     <w:uiPriority w:val="9"/>
     <w:semiHidden/>
     <w:rsid w:val="00842B12"/>
@@ -1435,10 +953,10 @@
       <w:szCs w:val="32"/>
     </w:rPr>
   </w:style>
-  <w:style w:type="character" w:customStyle="1" w:styleId="40">
-    <w:name w:val="标题 4 字符"/>
-    <w:basedOn w:val="a0"/>
-    <w:link w:val="4"/>
+  <w:style w:type="character" w:customStyle="1" w:styleId="Heading4Char">
+    <w:name w:val="Heading 4 Char"/>
+    <w:basedOn w:val="DefaultParagraphFont"/>
+    <w:link w:val="Heading4"/>
     <w:uiPriority w:val="9"/>
     <w:semiHidden/>
     <w:rsid w:val="00842B12"/>
@@ -1449,10 +967,10 @@
       <w:szCs w:val="28"/>
     </w:rPr>
   </w:style>
-  <w:style w:type="character" w:customStyle="1" w:styleId="50">
-    <w:name w:val="标题 5 字符"/>
-    <w:basedOn w:val="a0"/>
-    <w:link w:val="5"/>
+  <w:style w:type="character" w:customStyle="1" w:styleId="Heading5Char">
+    <w:name w:val="Heading 5 Char"/>
+    <w:basedOn w:val="DefaultParagraphFont"/>
+    <w:link w:val="Heading5"/>
     <w:uiPriority w:val="9"/>
     <w:semiHidden/>
     <w:rsid w:val="00842B12"/>
@@ -1462,10 +980,10 @@
       <w:sz w:val="24"/>
     </w:rPr>
   </w:style>
-  <w:style w:type="character" w:customStyle="1" w:styleId="60">
-    <w:name w:val="标题 6 字符"/>
-    <w:basedOn w:val="a0"/>
-    <w:link w:val="6"/>
+  <w:style w:type="character" w:customStyle="1" w:styleId="Heading6Char">
+    <w:name w:val="Heading 6 Char"/>
+    <w:basedOn w:val="DefaultParagraphFont"/>
+    <w:link w:val="Heading6"/>
     <w:uiPriority w:val="9"/>
     <w:semiHidden/>
     <w:rsid w:val="00842B12"/>
@@ -1476,10 +994,10 @@
       <w:color w:val="0F4761" w:themeColor="accent1" w:themeShade="BF"/>
     </w:rPr>
   </w:style>
-  <w:style w:type="character" w:customStyle="1" w:styleId="70">
-    <w:name w:val="标题 7 字符"/>
-    <w:basedOn w:val="a0"/>
-    <w:link w:val="7"/>
+  <w:style w:type="character" w:customStyle="1" w:styleId="Heading7Char">
+    <w:name w:val="Heading 7 Char"/>
+    <w:basedOn w:val="DefaultParagraphFont"/>
+    <w:link w:val="Heading7"/>
     <w:uiPriority w:val="9"/>
     <w:semiHidden/>
     <w:rsid w:val="00842B12"/>
@@ -1490,10 +1008,10 @@
       <w:color w:val="595959" w:themeColor="text1" w:themeTint="A6"/>
     </w:rPr>
   </w:style>
-  <w:style w:type="character" w:customStyle="1" w:styleId="80">
-    <w:name w:val="标题 8 字符"/>
-    <w:basedOn w:val="a0"/>
-    <w:link w:val="8"/>
+  <w:style w:type="character" w:customStyle="1" w:styleId="Heading8Char">
+    <w:name w:val="Heading 8 Char"/>
+    <w:basedOn w:val="DefaultParagraphFont"/>
+    <w:link w:val="Heading8"/>
     <w:uiPriority w:val="9"/>
     <w:semiHidden/>
     <w:rsid w:val="00842B12"/>
@@ -1502,10 +1020,10 @@
       <w:color w:val="595959" w:themeColor="text1" w:themeTint="A6"/>
     </w:rPr>
   </w:style>
-  <w:style w:type="character" w:customStyle="1" w:styleId="90">
-    <w:name w:val="标题 9 字符"/>
-    <w:basedOn w:val="a0"/>
-    <w:link w:val="9"/>
+  <w:style w:type="character" w:customStyle="1" w:styleId="Heading9Char">
+    <w:name w:val="Heading 9 Char"/>
+    <w:basedOn w:val="DefaultParagraphFont"/>
+    <w:link w:val="Heading9"/>
     <w:uiPriority w:val="9"/>
     <w:semiHidden/>
     <w:rsid w:val="00842B12"/>
@@ -1514,11 +1032,11 @@
       <w:color w:val="595959" w:themeColor="text1" w:themeTint="A6"/>
     </w:rPr>
   </w:style>
-  <w:style w:type="paragraph" w:styleId="a3">
+  <w:style w:type="paragraph" w:styleId="Title">
     <w:name w:val="Title"/>
-    <w:basedOn w:val="a"/>
-    <w:next w:val="a"/>
-    <w:link w:val="a4"/>
+    <w:basedOn w:val="Normal"/>
+    <w:next w:val="Normal"/>
+    <w:link w:val="TitleChar"/>
     <w:uiPriority w:val="10"/>
     <w:qFormat/>
     <w:rsid w:val="00842B12"/>
@@ -1535,10 +1053,10 @@
       <w:szCs w:val="56"/>
     </w:rPr>
   </w:style>
-  <w:style w:type="character" w:customStyle="1" w:styleId="a4">
-    <w:name w:val="标题 字符"/>
-    <w:basedOn w:val="a0"/>
-    <w:link w:val="a3"/>
+  <w:style w:type="character" w:customStyle="1" w:styleId="TitleChar">
+    <w:name w:val="Title Char"/>
+    <w:basedOn w:val="DefaultParagraphFont"/>
+    <w:link w:val="Title"/>
     <w:uiPriority w:val="10"/>
     <w:rsid w:val="00842B12"/>
     <w:rPr>
@@ -1549,11 +1067,11 @@
       <w:szCs w:val="56"/>
     </w:rPr>
   </w:style>
-  <w:style w:type="paragraph" w:styleId="a5">
+  <w:style w:type="paragraph" w:styleId="Subtitle">
     <w:name w:val="Subtitle"/>
-    <w:basedOn w:val="a"/>
-    <w:next w:val="a"/>
-    <w:link w:val="a6"/>
+    <w:basedOn w:val="Normal"/>
+    <w:next w:val="Normal"/>
+    <w:link w:val="SubtitleChar"/>
     <w:uiPriority w:val="11"/>
     <w:qFormat/>
     <w:rsid w:val="00842B12"/>
@@ -1571,10 +1089,10 @@
       <w:szCs w:val="28"/>
     </w:rPr>
   </w:style>
-  <w:style w:type="character" w:customStyle="1" w:styleId="a6">
-    <w:name w:val="副标题 字符"/>
-    <w:basedOn w:val="a0"/>
-    <w:link w:val="a5"/>
+  <w:style w:type="character" w:customStyle="1" w:styleId="SubtitleChar">
+    <w:name w:val="Subtitle Char"/>
+    <w:basedOn w:val="DefaultParagraphFont"/>
+    <w:link w:val="Subtitle"/>
     <w:uiPriority w:val="11"/>
     <w:rsid w:val="00842B12"/>
     <w:rPr>
@@ -1585,11 +1103,11 @@
       <w:szCs w:val="28"/>
     </w:rPr>
   </w:style>
-  <w:style w:type="paragraph" w:styleId="a7">
+  <w:style w:type="paragraph" w:styleId="Quote">
     <w:name w:val="Quote"/>
-    <w:basedOn w:val="a"/>
-    <w:next w:val="a"/>
-    <w:link w:val="a8"/>
+    <w:basedOn w:val="Normal"/>
+    <w:next w:val="Normal"/>
+    <w:link w:val="QuoteChar"/>
     <w:uiPriority w:val="29"/>
     <w:qFormat/>
     <w:rsid w:val="00842B12"/>
@@ -1603,10 +1121,10 @@
       <w:color w:val="404040" w:themeColor="text1" w:themeTint="BF"/>
     </w:rPr>
   </w:style>
-  <w:style w:type="character" w:customStyle="1" w:styleId="a8">
-    <w:name w:val="引用 字符"/>
-    <w:basedOn w:val="a0"/>
-    <w:link w:val="a7"/>
+  <w:style w:type="character" w:customStyle="1" w:styleId="QuoteChar">
+    <w:name w:val="Quote Char"/>
+    <w:basedOn w:val="DefaultParagraphFont"/>
+    <w:link w:val="Quote"/>
     <w:uiPriority w:val="29"/>
     <w:rsid w:val="00842B12"/>
     <w:rPr>
@@ -1615,9 +1133,9 @@
       <w:color w:val="404040" w:themeColor="text1" w:themeTint="BF"/>
     </w:rPr>
   </w:style>
-  <w:style w:type="paragraph" w:styleId="a9">
+  <w:style w:type="paragraph" w:styleId="ListParagraph">
     <w:name w:val="List Paragraph"/>
-    <w:basedOn w:val="a"/>
+    <w:basedOn w:val="Normal"/>
     <w:uiPriority w:val="34"/>
     <w:qFormat/>
     <w:rsid w:val="00842B12"/>
@@ -1626,9 +1144,9 @@
       <w:contextualSpacing/>
     </w:pPr>
   </w:style>
-  <w:style w:type="character" w:styleId="aa">
+  <w:style w:type="character" w:styleId="IntenseEmphasis">
     <w:name w:val="Intense Emphasis"/>
-    <w:basedOn w:val="a0"/>
+    <w:basedOn w:val="DefaultParagraphFont"/>
     <w:uiPriority w:val="21"/>
     <w:qFormat/>
     <w:rsid w:val="00842B12"/>
@@ -1638,11 +1156,11 @@
       <w:color w:val="0F4761" w:themeColor="accent1" w:themeShade="BF"/>
     </w:rPr>
   </w:style>
-  <w:style w:type="paragraph" w:styleId="ab">
+  <w:style w:type="paragraph" w:styleId="IntenseQuote">
     <w:name w:val="Intense Quote"/>
-    <w:basedOn w:val="a"/>
-    <w:next w:val="a"/>
-    <w:link w:val="ac"/>
+    <w:basedOn w:val="Normal"/>
+    <w:next w:val="Normal"/>
+    <w:link w:val="IntenseQuoteChar"/>
     <w:uiPriority w:val="30"/>
     <w:qFormat/>
     <w:rsid w:val="00842B12"/>
@@ -1661,10 +1179,10 @@
       <w:color w:val="0F4761" w:themeColor="accent1" w:themeShade="BF"/>
     </w:rPr>
   </w:style>
-  <w:style w:type="character" w:customStyle="1" w:styleId="ac">
-    <w:name w:val="明显引用 字符"/>
-    <w:basedOn w:val="a0"/>
-    <w:link w:val="ab"/>
+  <w:style w:type="character" w:customStyle="1" w:styleId="IntenseQuoteChar">
+    <w:name w:val="Intense Quote Char"/>
+    <w:basedOn w:val="DefaultParagraphFont"/>
+    <w:link w:val="IntenseQuote"/>
     <w:uiPriority w:val="30"/>
     <w:rsid w:val="00842B12"/>
     <w:rPr>
@@ -1673,9 +1191,9 @@
       <w:color w:val="0F4761" w:themeColor="accent1" w:themeShade="BF"/>
     </w:rPr>
   </w:style>
-  <w:style w:type="character" w:styleId="ad">
+  <w:style w:type="character" w:styleId="IntenseReference">
     <w:name w:val="Intense Reference"/>
-    <w:basedOn w:val="a0"/>
+    <w:basedOn w:val="DefaultParagraphFont"/>
     <w:uiPriority w:val="32"/>
     <w:qFormat/>
     <w:rsid w:val="00842B12"/>

</xml_diff>